<commit_message>
Brochure: 4 plan cards, Reminder & Check-in Messages feature, GPS reqs
- Pay-as-you-go shown as a 4th plan card (reduced plan fonts to fit)
- Added "Reminder & Check-in Messages" feature (SMS/WhatsApp/email)
  with Google Maps GPS-directions link — brochure full-width card +
  CLAUDE.md messaging, product feature brief, solution design
- GPS coordinates required for Mexican listings (addresses unreliable);
  added to CLAUDE onboarding, product brief, and solution-design data
  quality; Twilio noted for SMS/WhatsApp

Co-Authored-By: Claude Opus 4.6 <noreply@anthropic.com>
</commit_message>
<xml_diff>
--- a/docs/planning/Familiar_Guest_Product_Feature_Brief_Mexico.docx
+++ b/docs/planning/Familiar_Guest_Product_Feature_Brief_Mexico.docx
@@ -91,7 +91,7 @@
       <w:r>
         <w:t xml:space="preserve">stylesheet: </w:t>
       </w:r>
-      <w:hyperlink w:history="1" r:id="rId-5qhp0s0wj8dd7f9ixqvz">
+      <w:hyperlink w:history="1" r:id="rIdarmr4opnsymbhtenr9u2d">
         <w:r>
           <w:rPr>
             <w:rStyle w:val="MdLink"/>
@@ -644,6 +644,45 @@
     </w:p>
     <w:p>
       <w:pPr>
+        <w:pStyle w:val="ListParagraph"/>
+        <w:pStyle w:val="MdListItem"/>
+        <w:numPr>
+          <w:ilvl w:val="0"/>
+          <w:numId w:val="1"/>
+        </w:numPr>
+      </w:pPr>
+      <w:r>
+        <w:rPr>
+          <w:rStyle w:val="MdTag"/>
+        </w:rPr>
+        <w:t xml:space="preserve">&lt;span class="pill-x"&gt;</w:t>
+      </w:r>
+      <w:r>
+        <w:t xml:space="preserve">cross-border</w:t>
+      </w:r>
+      <w:r>
+        <w:rPr>
+          <w:rStyle w:val="MdTag"/>
+        </w:rPr>
+        <w:t xml:space="preserve">&lt;/span&gt;</w:t>
+      </w:r>
+      <w:r>
+        <w:t xml:space="preserve"> </w:t>
+      </w:r>
+      <w:r>
+        <w:rPr>
+          <w:rStyle w:val="MdStrong"/>
+          <w:b/>
+          <w:bCs/>
+        </w:rPr>
+        <w:t xml:space="preserve">GPS coordinates (required for Mexico)</w:t>
+      </w:r>
+      <w:r>
+        <w:t xml:space="preserve"> — capture lat/long at listing creation (Mexican street addresses are unreliable); powers map display and the Google Maps directions link in check-in messages.</w:t>
+      </w:r>
+    </w:p>
+    <w:p>
+      <w:pPr>
         <w:pStyle w:val="MdSpace"/>
       </w:pPr>
     </w:p>
@@ -1823,10 +1862,32 @@
           <w:b/>
           <w:bCs/>
         </w:rPr>
-        <w:t xml:space="preserve">Automated messaging (bilingual)</w:t>
-      </w:r>
-      <w:r>
-        <w:t xml:space="preserve"> — confirmation, pre-arrival, check-in, mid-stay, checkout, deposit-release, via Resend.</w:t>
+        <w:t xml:space="preserve">Reminder &amp;amp; check-in messages (bilingual, multi-channel)</w:t>
+      </w:r>
+      <w:r>
+        <w:t xml:space="preserve"> — confirmation, pre-arrival, check-in, mid-stay, checkout, deposit-release — delivered by </w:t>
+      </w:r>
+      <w:r>
+        <w:rPr>
+          <w:rStyle w:val="MdStrong"/>
+          <w:b/>
+          <w:bCs/>
+        </w:rPr>
+        <w:t xml:space="preserve">text (SMS), WhatsApp, and email</w:t>
+      </w:r>
+      <w:r>
+        <w:t xml:space="preserve">. Check-in messages include a </w:t>
+      </w:r>
+      <w:r>
+        <w:rPr>
+          <w:rStyle w:val="MdStrong"/>
+          <w:b/>
+          <w:bCs/>
+        </w:rPr>
+        <w:t xml:space="preserve">Google Maps GPS-directions link</w:t>
+      </w:r>
+      <w:r>
+        <w:t xml:space="preserve"> to the home.</w:t>
       </w:r>
     </w:p>
     <w:p>

</xml_diff>